<commit_message>
Slight updates, slightly newer data.
</commit_message>
<xml_diff>
--- a/Project/BMLB_Project_description_and_instruction_2025.docx
+++ b/Project/BMLB_Project_description_and_instruction_2025.docx
@@ -2798,6 +2798,15 @@
           <w:szCs w:val="24"/>
           <w:lang w:eastAsia="en-GB"/>
         </w:rPr>
+        <w:t>_2026</w:t>
+      </w:r>
+      <w:r>
+        <w:rPr>
+          <w:rFonts w:ascii="Consolas" w:eastAsia="Times New Roman" w:hAnsi="Consolas" w:cs="Consolas"/>
+          <w:sz w:val="24"/>
+          <w:szCs w:val="24"/>
+          <w:lang w:eastAsia="en-GB"/>
+        </w:rPr>
         <w:t>.csv</w:t>
       </w:r>
       <w:r>
@@ -2870,6 +2879,15 @@
           <w:szCs w:val="24"/>
           <w:lang w:eastAsia="en-GB"/>
         </w:rPr>
+        <w:t>_2026</w:t>
+      </w:r>
+      <w:r>
+        <w:rPr>
+          <w:rFonts w:ascii="Consolas" w:eastAsia="Times New Roman" w:hAnsi="Consolas" w:cs="Consolas"/>
+          <w:sz w:val="24"/>
+          <w:szCs w:val="24"/>
+          <w:lang w:eastAsia="en-GB"/>
+        </w:rPr>
         <w:t>.csv</w:t>
       </w:r>
       <w:r>
@@ -2898,6 +2916,15 @@
           <w:lang w:eastAsia="en-GB"/>
         </w:rPr>
         <w:t>5</w:t>
+      </w:r>
+      <w:r>
+        <w:rPr>
+          <w:rFonts w:ascii="Consolas" w:eastAsia="Times New Roman" w:hAnsi="Consolas" w:cs="Consolas"/>
+          <w:sz w:val="24"/>
+          <w:szCs w:val="24"/>
+          <w:lang w:eastAsia="en-GB"/>
+        </w:rPr>
+        <w:t>_2026</w:t>
       </w:r>
       <w:r>
         <w:rPr>

</xml_diff>

<commit_message>
Slight change project description
</commit_message>
<xml_diff>
--- a/Project/BMLB_Project_description_and_instruction_2025.docx
+++ b/Project/BMLB_Project_description_and_instruction_2025.docx
@@ -745,6 +745,37 @@
         </w:rPr>
         <w:t xml:space="preserve"> hand in one notebook per team so you can also work together on one laptop, whatever suits you.</w:t>
       </w:r>
+      <w:r>
+        <w:rPr>
+          <w:rFonts w:ascii="Times New Roman" w:eastAsia="Times New Roman" w:hAnsi="Times New Roman" w:cs="Times New Roman"/>
+          <w:sz w:val="24"/>
+          <w:szCs w:val="24"/>
+          <w:lang w:eastAsia="en-GB"/>
+        </w:rPr>
+        <w:br/>
+        <w:t xml:space="preserve">A great idea is also to use Google Colab: </w:t>
+      </w:r>
+      <w:hyperlink r:id="rId11" w:history="1">
+        <w:r>
+          <w:rPr>
+            <w:rStyle w:val="Hyperlink"/>
+            <w:rFonts w:ascii="Times New Roman" w:eastAsia="Times New Roman" w:hAnsi="Times New Roman" w:cs="Times New Roman"/>
+            <w:sz w:val="24"/>
+            <w:szCs w:val="24"/>
+            <w:lang w:eastAsia="en-GB"/>
+          </w:rPr>
+          <w:t>https://colab.research.google.com/</w:t>
+        </w:r>
+      </w:hyperlink>
+      <w:r>
+        <w:rPr>
+          <w:rFonts w:ascii="Times New Roman" w:eastAsia="Times New Roman" w:hAnsi="Times New Roman" w:cs="Times New Roman"/>
+          <w:sz w:val="24"/>
+          <w:szCs w:val="24"/>
+          <w:lang w:eastAsia="en-GB"/>
+        </w:rPr>
+        <w:t xml:space="preserve"> </w:t>
+      </w:r>
     </w:p>
     <w:p>
       <w:pPr>
@@ -877,7 +908,66 @@
           <w:szCs w:val="24"/>
           <w:lang w:eastAsia="en-GB"/>
         </w:rPr>
-        <w:t xml:space="preserve">otebook file. This file needs to be handed in to me on </w:t>
+        <w:t>otebook</w:t>
+      </w:r>
+      <w:r>
+        <w:rPr>
+          <w:rFonts w:ascii="Times New Roman" w:eastAsia="Times New Roman" w:hAnsi="Times New Roman" w:cs="Times New Roman"/>
+          <w:b/>
+          <w:bCs/>
+          <w:sz w:val="24"/>
+          <w:szCs w:val="24"/>
+          <w:lang w:eastAsia="en-GB"/>
+        </w:rPr>
+        <w:t xml:space="preserve"> </w:t>
+      </w:r>
+      <w:proofErr w:type="gramStart"/>
+      <w:r>
+        <w:rPr>
+          <w:rFonts w:ascii="Times New Roman" w:eastAsia="Times New Roman" w:hAnsi="Times New Roman" w:cs="Times New Roman"/>
+          <w:b/>
+          <w:bCs/>
+          <w:sz w:val="24"/>
+          <w:szCs w:val="24"/>
+          <w:lang w:eastAsia="en-GB"/>
+        </w:rPr>
+        <w:t>(.</w:t>
+      </w:r>
+      <w:proofErr w:type="spellStart"/>
+      <w:r>
+        <w:rPr>
+          <w:rFonts w:ascii="Times New Roman" w:eastAsia="Times New Roman" w:hAnsi="Times New Roman" w:cs="Times New Roman"/>
+          <w:b/>
+          <w:bCs/>
+          <w:sz w:val="24"/>
+          <w:szCs w:val="24"/>
+          <w:lang w:eastAsia="en-GB"/>
+        </w:rPr>
+        <w:t>ipynb</w:t>
+      </w:r>
+      <w:proofErr w:type="spellEnd"/>
+      <w:proofErr w:type="gramEnd"/>
+      <w:r>
+        <w:rPr>
+          <w:rFonts w:ascii="Times New Roman" w:eastAsia="Times New Roman" w:hAnsi="Times New Roman" w:cs="Times New Roman"/>
+          <w:b/>
+          <w:bCs/>
+          <w:sz w:val="24"/>
+          <w:szCs w:val="24"/>
+          <w:lang w:eastAsia="en-GB"/>
+        </w:rPr>
+        <w:t>)</w:t>
+      </w:r>
+      <w:r>
+        <w:rPr>
+          <w:rFonts w:ascii="Times New Roman" w:eastAsia="Times New Roman" w:hAnsi="Times New Roman" w:cs="Times New Roman"/>
+          <w:b/>
+          <w:bCs/>
+          <w:sz w:val="24"/>
+          <w:szCs w:val="24"/>
+          <w:lang w:eastAsia="en-GB"/>
+        </w:rPr>
+        <w:t xml:space="preserve"> file. This file needs to be handed in to me on </w:t>
       </w:r>
       <w:r>
         <w:rPr>
@@ -1530,16 +1620,7 @@
           <w:szCs w:val="24"/>
           <w:lang w:eastAsia="en-GB"/>
         </w:rPr>
-        <w:t>You will only be graded on whether you correctly perform the guided exercises (correctly means: you do what is asked,</w:t>
-      </w:r>
-      <w:r>
-        <w:rPr>
-          <w:rFonts w:ascii="Times New Roman" w:eastAsia="Times New Roman" w:hAnsi="Times New Roman" w:cs="Times New Roman"/>
-          <w:sz w:val="24"/>
-          <w:szCs w:val="24"/>
-          <w:lang w:eastAsia="en-GB"/>
-        </w:rPr>
-        <w:t xml:space="preserve"> you supply </w:t>
+        <w:t xml:space="preserve">You will only be graded on whether you </w:t>
       </w:r>
       <w:r>
         <w:rPr>
@@ -1549,7 +1630,16 @@
           <w:lang w:eastAsia="en-GB"/>
         </w:rPr>
         <w:lastRenderedPageBreak/>
-        <w:t>answers to the questions</w:t>
+        <w:t>correctly perform the guided exercises (correctly means: you do what is asked,</w:t>
+      </w:r>
+      <w:r>
+        <w:rPr>
+          <w:rFonts w:ascii="Times New Roman" w:eastAsia="Times New Roman" w:hAnsi="Times New Roman" w:cs="Times New Roman"/>
+          <w:sz w:val="24"/>
+          <w:szCs w:val="24"/>
+          <w:lang w:eastAsia="en-GB"/>
+        </w:rPr>
+        <w:t xml:space="preserve"> you supply answers to the questions</w:t>
       </w:r>
       <w:r>
         <w:rPr>
@@ -2148,442 +2238,6 @@
           <w:lang w:eastAsia="en-GB"/>
         </w:rPr>
         <w:t xml:space="preserve"> (see </w:t>
-      </w:r>
-      <w:hyperlink r:id="rId11" w:history="1">
-        <w:r>
-          <w:rPr>
-            <w:rStyle w:val="Hyperlink"/>
-            <w:rFonts w:ascii="Times New Roman" w:eastAsia="Times New Roman" w:hAnsi="Times New Roman" w:cs="Times New Roman"/>
-            <w:sz w:val="24"/>
-            <w:szCs w:val="24"/>
-            <w:lang w:eastAsia="en-GB"/>
-          </w:rPr>
-          <w:t>here</w:t>
-        </w:r>
-      </w:hyperlink>
-      <w:r>
-        <w:rPr>
-          <w:rFonts w:ascii="Times New Roman" w:eastAsia="Times New Roman" w:hAnsi="Times New Roman" w:cs="Times New Roman"/>
-          <w:sz w:val="24"/>
-          <w:szCs w:val="24"/>
-          <w:lang w:eastAsia="en-GB"/>
-        </w:rPr>
-        <w:t>)</w:t>
-      </w:r>
-      <w:r>
-        <w:rPr>
-          <w:rFonts w:ascii="Times New Roman" w:eastAsia="Times New Roman" w:hAnsi="Times New Roman" w:cs="Times New Roman"/>
-          <w:sz w:val="24"/>
-          <w:szCs w:val="24"/>
-          <w:lang w:eastAsia="en-GB"/>
-        </w:rPr>
-        <w:t>. Successive gene expression studies have identified different amounts of subtypes (where, as often, histological subtyping (looking at tissues) and genetic subtyping (clustering based on gene expression data) don’t always align). Of course</w:t>
-      </w:r>
-      <w:r>
-        <w:rPr>
-          <w:rFonts w:ascii="Times New Roman" w:eastAsia="Times New Roman" w:hAnsi="Times New Roman" w:cs="Times New Roman"/>
-          <w:sz w:val="24"/>
-          <w:szCs w:val="24"/>
-          <w:lang w:eastAsia="en-GB"/>
-        </w:rPr>
-        <w:t xml:space="preserve">, </w:t>
-      </w:r>
-      <w:r>
-        <w:rPr>
-          <w:rFonts w:ascii="Times New Roman" w:eastAsia="Times New Roman" w:hAnsi="Times New Roman" w:cs="Times New Roman"/>
-          <w:sz w:val="24"/>
-          <w:szCs w:val="24"/>
-          <w:lang w:eastAsia="en-GB"/>
-        </w:rPr>
-        <w:t xml:space="preserve">the genetic expression </w:t>
-      </w:r>
-      <w:r>
-        <w:rPr>
-          <w:rFonts w:ascii="Times New Roman" w:eastAsia="Times New Roman" w:hAnsi="Times New Roman" w:cs="Times New Roman"/>
-          <w:sz w:val="24"/>
-          <w:szCs w:val="24"/>
-          <w:lang w:eastAsia="en-GB"/>
-        </w:rPr>
-        <w:t>subtypes</w:t>
-      </w:r>
-      <w:r>
-        <w:rPr>
-          <w:rFonts w:ascii="Times New Roman" w:eastAsia="Times New Roman" w:hAnsi="Times New Roman" w:cs="Times New Roman"/>
-          <w:sz w:val="24"/>
-          <w:szCs w:val="24"/>
-          <w:lang w:eastAsia="en-GB"/>
-        </w:rPr>
-        <w:t xml:space="preserve"> also don’t</w:t>
-      </w:r>
-      <w:r>
-        <w:rPr>
-          <w:rFonts w:ascii="Times New Roman" w:eastAsia="Times New Roman" w:hAnsi="Times New Roman" w:cs="Times New Roman"/>
-          <w:sz w:val="24"/>
-          <w:szCs w:val="24"/>
-          <w:lang w:eastAsia="en-GB"/>
-        </w:rPr>
-        <w:t xml:space="preserve"> completely</w:t>
-      </w:r>
-      <w:r>
-        <w:rPr>
-          <w:rFonts w:ascii="Times New Roman" w:eastAsia="Times New Roman" w:hAnsi="Times New Roman" w:cs="Times New Roman"/>
-          <w:sz w:val="24"/>
-          <w:szCs w:val="24"/>
-          <w:lang w:eastAsia="en-GB"/>
-        </w:rPr>
-        <w:t xml:space="preserve"> </w:t>
-      </w:r>
-      <w:r>
-        <w:rPr>
-          <w:rFonts w:ascii="Times New Roman" w:eastAsia="Times New Roman" w:hAnsi="Times New Roman" w:cs="Times New Roman"/>
-          <w:sz w:val="24"/>
-          <w:szCs w:val="24"/>
-          <w:lang w:eastAsia="en-GB"/>
-        </w:rPr>
-        <w:t>match</w:t>
-      </w:r>
-      <w:r>
-        <w:rPr>
-          <w:rFonts w:ascii="Times New Roman" w:eastAsia="Times New Roman" w:hAnsi="Times New Roman" w:cs="Times New Roman"/>
-          <w:sz w:val="24"/>
-          <w:szCs w:val="24"/>
-          <w:lang w:eastAsia="en-GB"/>
-        </w:rPr>
-        <w:t xml:space="preserve"> each other. A recent </w:t>
-      </w:r>
-      <w:r>
-        <w:rPr>
-          <w:rFonts w:ascii="Times New Roman" w:eastAsia="Times New Roman" w:hAnsi="Times New Roman" w:cs="Times New Roman"/>
-          <w:sz w:val="24"/>
-          <w:szCs w:val="24"/>
-          <w:lang w:eastAsia="en-GB"/>
-        </w:rPr>
-        <w:t>synthesis</w:t>
-      </w:r>
-      <w:r>
-        <w:rPr>
-          <w:rFonts w:ascii="Times New Roman" w:eastAsia="Times New Roman" w:hAnsi="Times New Roman" w:cs="Times New Roman"/>
-          <w:sz w:val="24"/>
-          <w:szCs w:val="24"/>
-          <w:lang w:eastAsia="en-GB"/>
-        </w:rPr>
-        <w:t xml:space="preserve"> converged on 4 main subtypes of this cancer, characterised by mutations in some important factors.</w:t>
-      </w:r>
-      <w:r>
-        <w:rPr>
-          <w:rFonts w:ascii="Times New Roman" w:eastAsia="Times New Roman" w:hAnsi="Times New Roman" w:cs="Times New Roman"/>
-          <w:sz w:val="24"/>
-          <w:szCs w:val="24"/>
-          <w:lang w:eastAsia="en-GB"/>
-        </w:rPr>
-        <w:t xml:space="preserve"> Let us assume that each of these subtypes needs very different treatment regimes, and that current clinical tests don’t allow adequate separation between the cancer subtypes.</w:t>
-      </w:r>
-    </w:p>
-    <w:p>
-      <w:pPr>
-        <w:spacing w:before="100" w:beforeAutospacing="1" w:after="144" w:line="276" w:lineRule="auto"/>
-        <w:rPr>
-          <w:rFonts w:ascii="Times New Roman" w:eastAsia="Times New Roman" w:hAnsi="Times New Roman" w:cs="Times New Roman"/>
-          <w:sz w:val="24"/>
-          <w:szCs w:val="24"/>
-          <w:lang w:eastAsia="en-GB"/>
-        </w:rPr>
-      </w:pPr>
-      <w:r>
-        <w:rPr>
-          <w:rFonts w:ascii="Times New Roman" w:eastAsia="Times New Roman" w:hAnsi="Times New Roman" w:cs="Times New Roman"/>
-          <w:sz w:val="24"/>
-          <w:szCs w:val="24"/>
-          <w:lang w:eastAsia="en-GB"/>
-        </w:rPr>
-        <w:t xml:space="preserve">Our dataset is a simulated one, </w:t>
-      </w:r>
-      <w:r>
-        <w:rPr>
-          <w:rFonts w:ascii="Times New Roman" w:eastAsia="Times New Roman" w:hAnsi="Times New Roman" w:cs="Times New Roman"/>
-          <w:sz w:val="24"/>
-          <w:szCs w:val="24"/>
-          <w:lang w:eastAsia="en-GB"/>
-        </w:rPr>
-        <w:t>and</w:t>
-      </w:r>
-      <w:r>
-        <w:rPr>
-          <w:rFonts w:ascii="Times New Roman" w:eastAsia="Times New Roman" w:hAnsi="Times New Roman" w:cs="Times New Roman"/>
-          <w:sz w:val="24"/>
-          <w:szCs w:val="24"/>
-          <w:lang w:eastAsia="en-GB"/>
-        </w:rPr>
-        <w:t xml:space="preserve"> our </w:t>
-      </w:r>
-      <w:r>
-        <w:rPr>
-          <w:rFonts w:ascii="Times New Roman" w:eastAsia="Times New Roman" w:hAnsi="Times New Roman" w:cs="Times New Roman"/>
-          <w:sz w:val="24"/>
-          <w:szCs w:val="24"/>
-          <w:lang w:eastAsia="en-GB"/>
-        </w:rPr>
-        <w:t xml:space="preserve">hypothetical </w:t>
-      </w:r>
-      <w:r>
-        <w:rPr>
-          <w:rFonts w:ascii="Times New Roman" w:eastAsia="Times New Roman" w:hAnsi="Times New Roman" w:cs="Times New Roman"/>
-          <w:sz w:val="24"/>
-          <w:szCs w:val="24"/>
-          <w:lang w:eastAsia="en-GB"/>
-        </w:rPr>
-        <w:t xml:space="preserve">problem description is as follows:  </w:t>
-      </w:r>
-      <w:r>
-        <w:rPr>
-          <w:rFonts w:ascii="Times New Roman" w:eastAsia="Times New Roman" w:hAnsi="Times New Roman" w:cs="Times New Roman"/>
-          <w:sz w:val="24"/>
-          <w:szCs w:val="24"/>
-          <w:lang w:eastAsia="en-GB"/>
-        </w:rPr>
-        <w:t xml:space="preserve">given patient expression data, we want to make a diagnostic classifier that will tell us which cancer subtype the patient has. We can imagine that the expression data comes from a biopsy of a SCLC tumour. For our case, we have assayed all human protein-coding genes, and then pre-selected </w:t>
-      </w:r>
-      <w:r>
-        <w:rPr>
-          <w:rFonts w:ascii="Times New Roman" w:eastAsia="Times New Roman" w:hAnsi="Times New Roman" w:cs="Times New Roman"/>
-          <w:sz w:val="24"/>
-          <w:szCs w:val="24"/>
-          <w:lang w:eastAsia="en-GB"/>
-        </w:rPr>
-        <w:t>2</w:t>
-      </w:r>
-      <w:r>
-        <w:rPr>
-          <w:rFonts w:ascii="Times New Roman" w:eastAsia="Times New Roman" w:hAnsi="Times New Roman" w:cs="Times New Roman"/>
-          <w:sz w:val="24"/>
-          <w:szCs w:val="24"/>
-          <w:lang w:eastAsia="en-GB"/>
-        </w:rPr>
-        <w:t>000</w:t>
-      </w:r>
-      <w:r>
-        <w:rPr>
-          <w:rFonts w:ascii="Times New Roman" w:eastAsia="Times New Roman" w:hAnsi="Times New Roman" w:cs="Times New Roman"/>
-          <w:sz w:val="24"/>
-          <w:szCs w:val="24"/>
-          <w:lang w:eastAsia="en-GB"/>
-        </w:rPr>
-        <w:t xml:space="preserve"> </w:t>
-      </w:r>
-      <w:r>
-        <w:rPr>
-          <w:rFonts w:ascii="Times New Roman" w:eastAsia="Times New Roman" w:hAnsi="Times New Roman" w:cs="Times New Roman"/>
-          <w:sz w:val="24"/>
-          <w:szCs w:val="24"/>
-          <w:lang w:eastAsia="en-GB"/>
-        </w:rPr>
-        <w:t xml:space="preserve">(so </w:t>
-      </w:r>
-      <w:r>
-        <w:rPr>
-          <w:rFonts w:ascii="Times New Roman" w:eastAsia="Times New Roman" w:hAnsi="Times New Roman" w:cs="Times New Roman"/>
-          <w:b/>
-          <w:bCs/>
-          <w:sz w:val="24"/>
-          <w:szCs w:val="24"/>
-          <w:lang w:eastAsia="en-GB"/>
-        </w:rPr>
-        <w:t>2</w:t>
-      </w:r>
-      <w:r>
-        <w:rPr>
-          <w:rFonts w:ascii="Times New Roman" w:eastAsia="Times New Roman" w:hAnsi="Times New Roman" w:cs="Times New Roman"/>
-          <w:b/>
-          <w:bCs/>
-          <w:sz w:val="24"/>
-          <w:szCs w:val="24"/>
-          <w:lang w:eastAsia="en-GB"/>
-        </w:rPr>
-        <w:t>000</w:t>
-      </w:r>
-      <w:r>
-        <w:rPr>
-          <w:rFonts w:ascii="Times New Roman" w:eastAsia="Times New Roman" w:hAnsi="Times New Roman" w:cs="Times New Roman"/>
-          <w:b/>
-          <w:bCs/>
-          <w:sz w:val="24"/>
-          <w:szCs w:val="24"/>
-          <w:lang w:eastAsia="en-GB"/>
-        </w:rPr>
-        <w:t xml:space="preserve"> features</w:t>
-      </w:r>
-      <w:r>
-        <w:rPr>
-          <w:rFonts w:ascii="Times New Roman" w:eastAsia="Times New Roman" w:hAnsi="Times New Roman" w:cs="Times New Roman"/>
-          <w:sz w:val="24"/>
-          <w:szCs w:val="24"/>
-          <w:lang w:eastAsia="en-GB"/>
-        </w:rPr>
-        <w:t xml:space="preserve">) </w:t>
-      </w:r>
-      <w:r>
-        <w:rPr>
-          <w:rFonts w:ascii="Times New Roman" w:eastAsia="Times New Roman" w:hAnsi="Times New Roman" w:cs="Times New Roman"/>
-          <w:sz w:val="24"/>
-          <w:szCs w:val="24"/>
-          <w:lang w:eastAsia="en-GB"/>
-        </w:rPr>
-        <w:t xml:space="preserve">of them to keep the problem manageable (you can imagine that many genes don’t vary at all between the subtypes and hence would have no value whatsoever). </w:t>
-      </w:r>
-    </w:p>
-    <w:p>
-      <w:pPr>
-        <w:spacing w:before="100" w:beforeAutospacing="1" w:after="144" w:line="276" w:lineRule="auto"/>
-        <w:rPr>
-          <w:rFonts w:ascii="Times New Roman" w:eastAsia="Times New Roman" w:hAnsi="Times New Roman" w:cs="Times New Roman"/>
-          <w:sz w:val="24"/>
-          <w:szCs w:val="24"/>
-          <w:lang w:eastAsia="en-GB"/>
-        </w:rPr>
-      </w:pPr>
-      <w:r>
-        <w:rPr>
-          <w:rFonts w:ascii="Times New Roman" w:eastAsia="Times New Roman" w:hAnsi="Times New Roman" w:cs="Times New Roman"/>
-          <w:sz w:val="24"/>
-          <w:szCs w:val="24"/>
-          <w:lang w:eastAsia="en-GB"/>
-        </w:rPr>
-        <w:t xml:space="preserve">In our dataset we have samples from each of the </w:t>
-      </w:r>
-      <w:r>
-        <w:rPr>
-          <w:rFonts w:ascii="Times New Roman" w:eastAsia="Times New Roman" w:hAnsi="Times New Roman" w:cs="Times New Roman"/>
-          <w:b/>
-          <w:bCs/>
-          <w:sz w:val="24"/>
-          <w:szCs w:val="24"/>
-          <w:lang w:eastAsia="en-GB"/>
-        </w:rPr>
-        <w:t>4</w:t>
-      </w:r>
-      <w:r>
-        <w:rPr>
-          <w:rFonts w:ascii="Times New Roman" w:eastAsia="Times New Roman" w:hAnsi="Times New Roman" w:cs="Times New Roman"/>
-          <w:b/>
-          <w:bCs/>
-          <w:sz w:val="24"/>
-          <w:szCs w:val="24"/>
-          <w:lang w:eastAsia="en-GB"/>
-        </w:rPr>
-        <w:t xml:space="preserve"> classes</w:t>
-      </w:r>
-      <w:r>
-        <w:rPr>
-          <w:rFonts w:ascii="Times New Roman" w:eastAsia="Times New Roman" w:hAnsi="Times New Roman" w:cs="Times New Roman"/>
-          <w:sz w:val="24"/>
-          <w:szCs w:val="24"/>
-          <w:lang w:eastAsia="en-GB"/>
-        </w:rPr>
-        <w:t xml:space="preserve">. Unfortunately, the 4 subtypes </w:t>
-      </w:r>
-      <w:r>
-        <w:rPr>
-          <w:rFonts w:ascii="Times New Roman" w:eastAsia="Times New Roman" w:hAnsi="Times New Roman" w:cs="Times New Roman"/>
-          <w:sz w:val="24"/>
-          <w:szCs w:val="24"/>
-          <w:lang w:eastAsia="en-GB"/>
-        </w:rPr>
-        <w:t xml:space="preserve">have not been sampled equally, but we don’t know whether that’s because of actual population incidence (i.e. that one subtype occurs less often than another because it requires more specific mutations, say) or because of sampling (perhaps patients with one subtype experience problems later than others, but then deteriorate so rapidly that we haven’t been able to obtain as many biopsies of those tumour subtypes). </w:t>
-      </w:r>
-      <w:r>
-        <w:rPr>
-          <w:rFonts w:ascii="Times New Roman" w:eastAsia="Times New Roman" w:hAnsi="Times New Roman" w:cs="Times New Roman"/>
-          <w:b/>
-          <w:bCs/>
-          <w:sz w:val="24"/>
-          <w:szCs w:val="24"/>
-          <w:lang w:eastAsia="en-GB"/>
-        </w:rPr>
-        <w:t xml:space="preserve">We assume that </w:t>
-      </w:r>
-      <w:r>
-        <w:rPr>
-          <w:rFonts w:ascii="Times New Roman" w:eastAsia="Times New Roman" w:hAnsi="Times New Roman" w:cs="Times New Roman"/>
-          <w:b/>
-          <w:bCs/>
-          <w:sz w:val="24"/>
-          <w:szCs w:val="24"/>
-          <w:lang w:eastAsia="en-GB"/>
-        </w:rPr>
-        <w:t xml:space="preserve">we want to be equally effective at detecting all subtypes, so for those purposes take note that the dataset is </w:t>
-      </w:r>
-      <w:r>
-        <w:rPr>
-          <w:rFonts w:ascii="Times New Roman" w:eastAsia="Times New Roman" w:hAnsi="Times New Roman" w:cs="Times New Roman"/>
-          <w:b/>
-          <w:bCs/>
-          <w:i/>
-          <w:iCs/>
-          <w:sz w:val="24"/>
-          <w:szCs w:val="24"/>
-          <w:lang w:eastAsia="en-GB"/>
-        </w:rPr>
-        <w:t>imbalanced</w:t>
-      </w:r>
-      <w:r>
-        <w:rPr>
-          <w:rFonts w:ascii="Times New Roman" w:eastAsia="Times New Roman" w:hAnsi="Times New Roman" w:cs="Times New Roman"/>
-          <w:b/>
-          <w:bCs/>
-          <w:sz w:val="24"/>
-          <w:szCs w:val="24"/>
-          <w:lang w:eastAsia="en-GB"/>
-        </w:rPr>
-        <w:t xml:space="preserve">. </w:t>
-      </w:r>
-      <w:r>
-        <w:rPr>
-          <w:rFonts w:ascii="Times New Roman" w:eastAsia="Times New Roman" w:hAnsi="Times New Roman" w:cs="Times New Roman"/>
-          <w:sz w:val="24"/>
-          <w:szCs w:val="24"/>
-          <w:lang w:eastAsia="en-GB"/>
-        </w:rPr>
-        <w:t xml:space="preserve">The simplest fix for this is that you </w:t>
-      </w:r>
-      <w:proofErr w:type="spellStart"/>
-      <w:r>
-        <w:rPr>
-          <w:rFonts w:ascii="Times New Roman" w:eastAsia="Times New Roman" w:hAnsi="Times New Roman" w:cs="Times New Roman"/>
-          <w:sz w:val="24"/>
-          <w:szCs w:val="24"/>
-          <w:lang w:eastAsia="en-GB"/>
-        </w:rPr>
-        <w:t>downsample</w:t>
-      </w:r>
-      <w:proofErr w:type="spellEnd"/>
-      <w:r>
-        <w:rPr>
-          <w:rFonts w:ascii="Times New Roman" w:eastAsia="Times New Roman" w:hAnsi="Times New Roman" w:cs="Times New Roman"/>
-          <w:sz w:val="24"/>
-          <w:szCs w:val="24"/>
-          <w:lang w:eastAsia="en-GB"/>
-        </w:rPr>
-        <w:t xml:space="preserve"> the data, removing samples randomly from the training set for certain classes so that you have equal size data per class again. Of course, this leaves information on the table, and you can do smarter things down the line, if you want.</w:t>
-      </w:r>
-    </w:p>
-    <w:p>
-      <w:pPr>
-        <w:spacing w:before="100" w:beforeAutospacing="1" w:after="144" w:line="276" w:lineRule="auto"/>
-        <w:rPr>
-          <w:rFonts w:ascii="Times New Roman" w:eastAsia="Times New Roman" w:hAnsi="Times New Roman" w:cs="Times New Roman"/>
-          <w:sz w:val="24"/>
-          <w:szCs w:val="24"/>
-          <w:lang w:eastAsia="en-GB"/>
-        </w:rPr>
-      </w:pPr>
-      <w:r>
-        <w:rPr>
-          <w:rFonts w:ascii="Times New Roman" w:eastAsia="Times New Roman" w:hAnsi="Times New Roman" w:cs="Times New Roman"/>
-          <w:sz w:val="24"/>
-          <w:szCs w:val="24"/>
-          <w:lang w:eastAsia="en-GB"/>
-        </w:rPr>
-        <w:t xml:space="preserve">We can imagine that the data is in the format of Reads Per Kilobase Mapped reads (RPKM) (see </w:t>
       </w:r>
       <w:hyperlink r:id="rId12" w:history="1">
         <w:r>
@@ -2604,6 +2258,442 @@
           <w:szCs w:val="24"/>
           <w:lang w:eastAsia="en-GB"/>
         </w:rPr>
+        <w:t>)</w:t>
+      </w:r>
+      <w:r>
+        <w:rPr>
+          <w:rFonts w:ascii="Times New Roman" w:eastAsia="Times New Roman" w:hAnsi="Times New Roman" w:cs="Times New Roman"/>
+          <w:sz w:val="24"/>
+          <w:szCs w:val="24"/>
+          <w:lang w:eastAsia="en-GB"/>
+        </w:rPr>
+        <w:t>. Successive gene expression studies have identified different amounts of subtypes (where, as often, histological subtyping (looking at tissues) and genetic subtyping (clustering based on gene expression data) don’t always align). Of course</w:t>
+      </w:r>
+      <w:r>
+        <w:rPr>
+          <w:rFonts w:ascii="Times New Roman" w:eastAsia="Times New Roman" w:hAnsi="Times New Roman" w:cs="Times New Roman"/>
+          <w:sz w:val="24"/>
+          <w:szCs w:val="24"/>
+          <w:lang w:eastAsia="en-GB"/>
+        </w:rPr>
+        <w:t xml:space="preserve">, </w:t>
+      </w:r>
+      <w:r>
+        <w:rPr>
+          <w:rFonts w:ascii="Times New Roman" w:eastAsia="Times New Roman" w:hAnsi="Times New Roman" w:cs="Times New Roman"/>
+          <w:sz w:val="24"/>
+          <w:szCs w:val="24"/>
+          <w:lang w:eastAsia="en-GB"/>
+        </w:rPr>
+        <w:t xml:space="preserve">the genetic expression </w:t>
+      </w:r>
+      <w:r>
+        <w:rPr>
+          <w:rFonts w:ascii="Times New Roman" w:eastAsia="Times New Roman" w:hAnsi="Times New Roman" w:cs="Times New Roman"/>
+          <w:sz w:val="24"/>
+          <w:szCs w:val="24"/>
+          <w:lang w:eastAsia="en-GB"/>
+        </w:rPr>
+        <w:t>subtypes</w:t>
+      </w:r>
+      <w:r>
+        <w:rPr>
+          <w:rFonts w:ascii="Times New Roman" w:eastAsia="Times New Roman" w:hAnsi="Times New Roman" w:cs="Times New Roman"/>
+          <w:sz w:val="24"/>
+          <w:szCs w:val="24"/>
+          <w:lang w:eastAsia="en-GB"/>
+        </w:rPr>
+        <w:t xml:space="preserve"> also don’t</w:t>
+      </w:r>
+      <w:r>
+        <w:rPr>
+          <w:rFonts w:ascii="Times New Roman" w:eastAsia="Times New Roman" w:hAnsi="Times New Roman" w:cs="Times New Roman"/>
+          <w:sz w:val="24"/>
+          <w:szCs w:val="24"/>
+          <w:lang w:eastAsia="en-GB"/>
+        </w:rPr>
+        <w:t xml:space="preserve"> completely</w:t>
+      </w:r>
+      <w:r>
+        <w:rPr>
+          <w:rFonts w:ascii="Times New Roman" w:eastAsia="Times New Roman" w:hAnsi="Times New Roman" w:cs="Times New Roman"/>
+          <w:sz w:val="24"/>
+          <w:szCs w:val="24"/>
+          <w:lang w:eastAsia="en-GB"/>
+        </w:rPr>
+        <w:t xml:space="preserve"> </w:t>
+      </w:r>
+      <w:r>
+        <w:rPr>
+          <w:rFonts w:ascii="Times New Roman" w:eastAsia="Times New Roman" w:hAnsi="Times New Roman" w:cs="Times New Roman"/>
+          <w:sz w:val="24"/>
+          <w:szCs w:val="24"/>
+          <w:lang w:eastAsia="en-GB"/>
+        </w:rPr>
+        <w:t>match</w:t>
+      </w:r>
+      <w:r>
+        <w:rPr>
+          <w:rFonts w:ascii="Times New Roman" w:eastAsia="Times New Roman" w:hAnsi="Times New Roman" w:cs="Times New Roman"/>
+          <w:sz w:val="24"/>
+          <w:szCs w:val="24"/>
+          <w:lang w:eastAsia="en-GB"/>
+        </w:rPr>
+        <w:t xml:space="preserve"> each other. A recent </w:t>
+      </w:r>
+      <w:r>
+        <w:rPr>
+          <w:rFonts w:ascii="Times New Roman" w:eastAsia="Times New Roman" w:hAnsi="Times New Roman" w:cs="Times New Roman"/>
+          <w:sz w:val="24"/>
+          <w:szCs w:val="24"/>
+          <w:lang w:eastAsia="en-GB"/>
+        </w:rPr>
+        <w:t>synthesis</w:t>
+      </w:r>
+      <w:r>
+        <w:rPr>
+          <w:rFonts w:ascii="Times New Roman" w:eastAsia="Times New Roman" w:hAnsi="Times New Roman" w:cs="Times New Roman"/>
+          <w:sz w:val="24"/>
+          <w:szCs w:val="24"/>
+          <w:lang w:eastAsia="en-GB"/>
+        </w:rPr>
+        <w:t xml:space="preserve"> converged on 4 main subtypes of this cancer, characterised by mutations in some important factors.</w:t>
+      </w:r>
+      <w:r>
+        <w:rPr>
+          <w:rFonts w:ascii="Times New Roman" w:eastAsia="Times New Roman" w:hAnsi="Times New Roman" w:cs="Times New Roman"/>
+          <w:sz w:val="24"/>
+          <w:szCs w:val="24"/>
+          <w:lang w:eastAsia="en-GB"/>
+        </w:rPr>
+        <w:t xml:space="preserve"> Let us assume that each of these subtypes needs very different treatment regimes, and that current clinical tests don’t allow adequate separation between the cancer subtypes.</w:t>
+      </w:r>
+    </w:p>
+    <w:p>
+      <w:pPr>
+        <w:spacing w:before="100" w:beforeAutospacing="1" w:after="144" w:line="276" w:lineRule="auto"/>
+        <w:rPr>
+          <w:rFonts w:ascii="Times New Roman" w:eastAsia="Times New Roman" w:hAnsi="Times New Roman" w:cs="Times New Roman"/>
+          <w:sz w:val="24"/>
+          <w:szCs w:val="24"/>
+          <w:lang w:eastAsia="en-GB"/>
+        </w:rPr>
+      </w:pPr>
+      <w:r>
+        <w:rPr>
+          <w:rFonts w:ascii="Times New Roman" w:eastAsia="Times New Roman" w:hAnsi="Times New Roman" w:cs="Times New Roman"/>
+          <w:sz w:val="24"/>
+          <w:szCs w:val="24"/>
+          <w:lang w:eastAsia="en-GB"/>
+        </w:rPr>
+        <w:t xml:space="preserve">Our dataset is a simulated one, </w:t>
+      </w:r>
+      <w:r>
+        <w:rPr>
+          <w:rFonts w:ascii="Times New Roman" w:eastAsia="Times New Roman" w:hAnsi="Times New Roman" w:cs="Times New Roman"/>
+          <w:sz w:val="24"/>
+          <w:szCs w:val="24"/>
+          <w:lang w:eastAsia="en-GB"/>
+        </w:rPr>
+        <w:t>and</w:t>
+      </w:r>
+      <w:r>
+        <w:rPr>
+          <w:rFonts w:ascii="Times New Roman" w:eastAsia="Times New Roman" w:hAnsi="Times New Roman" w:cs="Times New Roman"/>
+          <w:sz w:val="24"/>
+          <w:szCs w:val="24"/>
+          <w:lang w:eastAsia="en-GB"/>
+        </w:rPr>
+        <w:t xml:space="preserve"> our </w:t>
+      </w:r>
+      <w:r>
+        <w:rPr>
+          <w:rFonts w:ascii="Times New Roman" w:eastAsia="Times New Roman" w:hAnsi="Times New Roman" w:cs="Times New Roman"/>
+          <w:sz w:val="24"/>
+          <w:szCs w:val="24"/>
+          <w:lang w:eastAsia="en-GB"/>
+        </w:rPr>
+        <w:t xml:space="preserve">hypothetical </w:t>
+      </w:r>
+      <w:r>
+        <w:rPr>
+          <w:rFonts w:ascii="Times New Roman" w:eastAsia="Times New Roman" w:hAnsi="Times New Roman" w:cs="Times New Roman"/>
+          <w:sz w:val="24"/>
+          <w:szCs w:val="24"/>
+          <w:lang w:eastAsia="en-GB"/>
+        </w:rPr>
+        <w:t xml:space="preserve">problem description is as follows:  </w:t>
+      </w:r>
+      <w:r>
+        <w:rPr>
+          <w:rFonts w:ascii="Times New Roman" w:eastAsia="Times New Roman" w:hAnsi="Times New Roman" w:cs="Times New Roman"/>
+          <w:sz w:val="24"/>
+          <w:szCs w:val="24"/>
+          <w:lang w:eastAsia="en-GB"/>
+        </w:rPr>
+        <w:t xml:space="preserve">given patient expression data, we want to make a diagnostic classifier that will tell us which cancer subtype the patient has. We can imagine that the expression data comes from a biopsy of a SCLC tumour. For our case, we have assayed all human protein-coding genes, and then pre-selected </w:t>
+      </w:r>
+      <w:r>
+        <w:rPr>
+          <w:rFonts w:ascii="Times New Roman" w:eastAsia="Times New Roman" w:hAnsi="Times New Roman" w:cs="Times New Roman"/>
+          <w:sz w:val="24"/>
+          <w:szCs w:val="24"/>
+          <w:lang w:eastAsia="en-GB"/>
+        </w:rPr>
+        <w:t>2</w:t>
+      </w:r>
+      <w:r>
+        <w:rPr>
+          <w:rFonts w:ascii="Times New Roman" w:eastAsia="Times New Roman" w:hAnsi="Times New Roman" w:cs="Times New Roman"/>
+          <w:sz w:val="24"/>
+          <w:szCs w:val="24"/>
+          <w:lang w:eastAsia="en-GB"/>
+        </w:rPr>
+        <w:t>000</w:t>
+      </w:r>
+      <w:r>
+        <w:rPr>
+          <w:rFonts w:ascii="Times New Roman" w:eastAsia="Times New Roman" w:hAnsi="Times New Roman" w:cs="Times New Roman"/>
+          <w:sz w:val="24"/>
+          <w:szCs w:val="24"/>
+          <w:lang w:eastAsia="en-GB"/>
+        </w:rPr>
+        <w:t xml:space="preserve"> </w:t>
+      </w:r>
+      <w:r>
+        <w:rPr>
+          <w:rFonts w:ascii="Times New Roman" w:eastAsia="Times New Roman" w:hAnsi="Times New Roman" w:cs="Times New Roman"/>
+          <w:sz w:val="24"/>
+          <w:szCs w:val="24"/>
+          <w:lang w:eastAsia="en-GB"/>
+        </w:rPr>
+        <w:t xml:space="preserve">(so </w:t>
+      </w:r>
+      <w:r>
+        <w:rPr>
+          <w:rFonts w:ascii="Times New Roman" w:eastAsia="Times New Roman" w:hAnsi="Times New Roman" w:cs="Times New Roman"/>
+          <w:b/>
+          <w:bCs/>
+          <w:sz w:val="24"/>
+          <w:szCs w:val="24"/>
+          <w:lang w:eastAsia="en-GB"/>
+        </w:rPr>
+        <w:t>2</w:t>
+      </w:r>
+      <w:r>
+        <w:rPr>
+          <w:rFonts w:ascii="Times New Roman" w:eastAsia="Times New Roman" w:hAnsi="Times New Roman" w:cs="Times New Roman"/>
+          <w:b/>
+          <w:bCs/>
+          <w:sz w:val="24"/>
+          <w:szCs w:val="24"/>
+          <w:lang w:eastAsia="en-GB"/>
+        </w:rPr>
+        <w:t>000</w:t>
+      </w:r>
+      <w:r>
+        <w:rPr>
+          <w:rFonts w:ascii="Times New Roman" w:eastAsia="Times New Roman" w:hAnsi="Times New Roman" w:cs="Times New Roman"/>
+          <w:b/>
+          <w:bCs/>
+          <w:sz w:val="24"/>
+          <w:szCs w:val="24"/>
+          <w:lang w:eastAsia="en-GB"/>
+        </w:rPr>
+        <w:t xml:space="preserve"> features</w:t>
+      </w:r>
+      <w:r>
+        <w:rPr>
+          <w:rFonts w:ascii="Times New Roman" w:eastAsia="Times New Roman" w:hAnsi="Times New Roman" w:cs="Times New Roman"/>
+          <w:sz w:val="24"/>
+          <w:szCs w:val="24"/>
+          <w:lang w:eastAsia="en-GB"/>
+        </w:rPr>
+        <w:t xml:space="preserve">) </w:t>
+      </w:r>
+      <w:r>
+        <w:rPr>
+          <w:rFonts w:ascii="Times New Roman" w:eastAsia="Times New Roman" w:hAnsi="Times New Roman" w:cs="Times New Roman"/>
+          <w:sz w:val="24"/>
+          <w:szCs w:val="24"/>
+          <w:lang w:eastAsia="en-GB"/>
+        </w:rPr>
+        <w:t xml:space="preserve">of them to keep the problem manageable (you can imagine that many genes don’t vary at all between the subtypes and hence would have no value whatsoever). </w:t>
+      </w:r>
+    </w:p>
+    <w:p>
+      <w:pPr>
+        <w:spacing w:before="100" w:beforeAutospacing="1" w:after="144" w:line="276" w:lineRule="auto"/>
+        <w:rPr>
+          <w:rFonts w:ascii="Times New Roman" w:eastAsia="Times New Roman" w:hAnsi="Times New Roman" w:cs="Times New Roman"/>
+          <w:sz w:val="24"/>
+          <w:szCs w:val="24"/>
+          <w:lang w:eastAsia="en-GB"/>
+        </w:rPr>
+      </w:pPr>
+      <w:r>
+        <w:rPr>
+          <w:rFonts w:ascii="Times New Roman" w:eastAsia="Times New Roman" w:hAnsi="Times New Roman" w:cs="Times New Roman"/>
+          <w:sz w:val="24"/>
+          <w:szCs w:val="24"/>
+          <w:lang w:eastAsia="en-GB"/>
+        </w:rPr>
+        <w:t xml:space="preserve">In our dataset we have samples from each of the </w:t>
+      </w:r>
+      <w:r>
+        <w:rPr>
+          <w:rFonts w:ascii="Times New Roman" w:eastAsia="Times New Roman" w:hAnsi="Times New Roman" w:cs="Times New Roman"/>
+          <w:b/>
+          <w:bCs/>
+          <w:sz w:val="24"/>
+          <w:szCs w:val="24"/>
+          <w:lang w:eastAsia="en-GB"/>
+        </w:rPr>
+        <w:t>4</w:t>
+      </w:r>
+      <w:r>
+        <w:rPr>
+          <w:rFonts w:ascii="Times New Roman" w:eastAsia="Times New Roman" w:hAnsi="Times New Roman" w:cs="Times New Roman"/>
+          <w:b/>
+          <w:bCs/>
+          <w:sz w:val="24"/>
+          <w:szCs w:val="24"/>
+          <w:lang w:eastAsia="en-GB"/>
+        </w:rPr>
+        <w:t xml:space="preserve"> classes</w:t>
+      </w:r>
+      <w:r>
+        <w:rPr>
+          <w:rFonts w:ascii="Times New Roman" w:eastAsia="Times New Roman" w:hAnsi="Times New Roman" w:cs="Times New Roman"/>
+          <w:sz w:val="24"/>
+          <w:szCs w:val="24"/>
+          <w:lang w:eastAsia="en-GB"/>
+        </w:rPr>
+        <w:t xml:space="preserve">. Unfortunately, the 4 subtypes </w:t>
+      </w:r>
+      <w:r>
+        <w:rPr>
+          <w:rFonts w:ascii="Times New Roman" w:eastAsia="Times New Roman" w:hAnsi="Times New Roman" w:cs="Times New Roman"/>
+          <w:sz w:val="24"/>
+          <w:szCs w:val="24"/>
+          <w:lang w:eastAsia="en-GB"/>
+        </w:rPr>
+        <w:t xml:space="preserve">have not been sampled equally, but we don’t know whether that’s because of actual population incidence (i.e. that one subtype occurs less often than another because it requires more specific mutations, say) or because of sampling (perhaps patients with one subtype experience problems later than others, but then deteriorate so rapidly that we haven’t been able to obtain as many biopsies of those tumour subtypes). </w:t>
+      </w:r>
+      <w:r>
+        <w:rPr>
+          <w:rFonts w:ascii="Times New Roman" w:eastAsia="Times New Roman" w:hAnsi="Times New Roman" w:cs="Times New Roman"/>
+          <w:b/>
+          <w:bCs/>
+          <w:sz w:val="24"/>
+          <w:szCs w:val="24"/>
+          <w:lang w:eastAsia="en-GB"/>
+        </w:rPr>
+        <w:t xml:space="preserve">We assume that </w:t>
+      </w:r>
+      <w:r>
+        <w:rPr>
+          <w:rFonts w:ascii="Times New Roman" w:eastAsia="Times New Roman" w:hAnsi="Times New Roman" w:cs="Times New Roman"/>
+          <w:b/>
+          <w:bCs/>
+          <w:sz w:val="24"/>
+          <w:szCs w:val="24"/>
+          <w:lang w:eastAsia="en-GB"/>
+        </w:rPr>
+        <w:t xml:space="preserve">we want to be equally effective at detecting all subtypes, so for those purposes take note that the dataset is </w:t>
+      </w:r>
+      <w:r>
+        <w:rPr>
+          <w:rFonts w:ascii="Times New Roman" w:eastAsia="Times New Roman" w:hAnsi="Times New Roman" w:cs="Times New Roman"/>
+          <w:b/>
+          <w:bCs/>
+          <w:i/>
+          <w:iCs/>
+          <w:sz w:val="24"/>
+          <w:szCs w:val="24"/>
+          <w:lang w:eastAsia="en-GB"/>
+        </w:rPr>
+        <w:t>imbalanced</w:t>
+      </w:r>
+      <w:r>
+        <w:rPr>
+          <w:rFonts w:ascii="Times New Roman" w:eastAsia="Times New Roman" w:hAnsi="Times New Roman" w:cs="Times New Roman"/>
+          <w:b/>
+          <w:bCs/>
+          <w:sz w:val="24"/>
+          <w:szCs w:val="24"/>
+          <w:lang w:eastAsia="en-GB"/>
+        </w:rPr>
+        <w:t xml:space="preserve">. </w:t>
+      </w:r>
+      <w:r>
+        <w:rPr>
+          <w:rFonts w:ascii="Times New Roman" w:eastAsia="Times New Roman" w:hAnsi="Times New Roman" w:cs="Times New Roman"/>
+          <w:sz w:val="24"/>
+          <w:szCs w:val="24"/>
+          <w:lang w:eastAsia="en-GB"/>
+        </w:rPr>
+        <w:t xml:space="preserve">The simplest fix for this is that you </w:t>
+      </w:r>
+      <w:proofErr w:type="spellStart"/>
+      <w:r>
+        <w:rPr>
+          <w:rFonts w:ascii="Times New Roman" w:eastAsia="Times New Roman" w:hAnsi="Times New Roman" w:cs="Times New Roman"/>
+          <w:sz w:val="24"/>
+          <w:szCs w:val="24"/>
+          <w:lang w:eastAsia="en-GB"/>
+        </w:rPr>
+        <w:t>downsample</w:t>
+      </w:r>
+      <w:proofErr w:type="spellEnd"/>
+      <w:r>
+        <w:rPr>
+          <w:rFonts w:ascii="Times New Roman" w:eastAsia="Times New Roman" w:hAnsi="Times New Roman" w:cs="Times New Roman"/>
+          <w:sz w:val="24"/>
+          <w:szCs w:val="24"/>
+          <w:lang w:eastAsia="en-GB"/>
+        </w:rPr>
+        <w:t xml:space="preserve"> the data, removing samples randomly from the training set for certain classes so that you have equal size data per class again. Of course, this leaves information on the table, and you can do smarter things down the line, if you want.</w:t>
+      </w:r>
+    </w:p>
+    <w:p>
+      <w:pPr>
+        <w:spacing w:before="100" w:beforeAutospacing="1" w:after="144" w:line="276" w:lineRule="auto"/>
+        <w:rPr>
+          <w:rFonts w:ascii="Times New Roman" w:eastAsia="Times New Roman" w:hAnsi="Times New Roman" w:cs="Times New Roman"/>
+          <w:sz w:val="24"/>
+          <w:szCs w:val="24"/>
+          <w:lang w:eastAsia="en-GB"/>
+        </w:rPr>
+      </w:pPr>
+      <w:r>
+        <w:rPr>
+          <w:rFonts w:ascii="Times New Roman" w:eastAsia="Times New Roman" w:hAnsi="Times New Roman" w:cs="Times New Roman"/>
+          <w:sz w:val="24"/>
+          <w:szCs w:val="24"/>
+          <w:lang w:eastAsia="en-GB"/>
+        </w:rPr>
+        <w:t xml:space="preserve">We can imagine that the data is in the format of Reads Per Kilobase Mapped reads (RPKM) (see </w:t>
+      </w:r>
+      <w:hyperlink r:id="rId13" w:history="1">
+        <w:r>
+          <w:rPr>
+            <w:rStyle w:val="Hyperlink"/>
+            <w:rFonts w:ascii="Times New Roman" w:eastAsia="Times New Roman" w:hAnsi="Times New Roman" w:cs="Times New Roman"/>
+            <w:sz w:val="24"/>
+            <w:szCs w:val="24"/>
+            <w:lang w:eastAsia="en-GB"/>
+          </w:rPr>
+          <w:t>here</w:t>
+        </w:r>
+      </w:hyperlink>
+      <w:r>
+        <w:rPr>
+          <w:rFonts w:ascii="Times New Roman" w:eastAsia="Times New Roman" w:hAnsi="Times New Roman" w:cs="Times New Roman"/>
+          <w:sz w:val="24"/>
+          <w:szCs w:val="24"/>
+          <w:lang w:eastAsia="en-GB"/>
+        </w:rPr>
         <w:t xml:space="preserve"> for a short discussion on some metrics for </w:t>
       </w:r>
       <w:proofErr w:type="spellStart"/>
@@ -3051,6 +3141,14 @@
           <w:sz w:val="24"/>
           <w:szCs w:val="24"/>
         </w:rPr>
+        <w:t>Is there any pattern in what’s missing?</w:t>
+      </w:r>
+      <w:r>
+        <w:rPr>
+          <w:rFonts w:ascii="Times New Roman" w:hAnsi="Times New Roman" w:cs="Times New Roman"/>
+          <w:sz w:val="24"/>
+          <w:szCs w:val="24"/>
+        </w:rPr>
         <w:br/>
       </w:r>
       <w:r>
@@ -3616,7 +3714,7 @@
         </w:rPr>
         <w:t xml:space="preserve"> Read up on these here (</w:t>
       </w:r>
-      <w:hyperlink r:id="rId13" w:history="1">
+      <w:hyperlink r:id="rId14" w:history="1">
         <w:r>
           <w:rPr>
             <w:rStyle w:val="Hyperlink"/>
@@ -3636,7 +3734,7 @@
         </w:rPr>
         <w:t xml:space="preserve">, </w:t>
       </w:r>
-      <w:hyperlink r:id="rId14" w:history="1">
+      <w:hyperlink r:id="rId15" w:history="1">
         <w:r>
           <w:rPr>
             <w:rStyle w:val="Hyperlink"/>
@@ -4176,7 +4274,7 @@
         </w:rPr>
         <w:t xml:space="preserve"> (or </w:t>
       </w:r>
-      <w:hyperlink r:id="rId15" w:history="1">
+      <w:hyperlink r:id="rId16" w:history="1">
         <w:r>
           <w:rPr>
             <w:rStyle w:val="Hyperlink"/>
@@ -5359,7 +5457,7 @@
         </w:rPr>
         <w:t xml:space="preserve"> (</w:t>
       </w:r>
-      <w:hyperlink r:id="rId16" w:history="1">
+      <w:hyperlink r:id="rId17" w:history="1">
         <w:r>
           <w:rPr>
             <w:rStyle w:val="Hyperlink"/>
@@ -5462,7 +5560,7 @@
         </w:rPr>
         <w:t xml:space="preserve"> (</w:t>
       </w:r>
-      <w:hyperlink r:id="rId17" w:history="1">
+      <w:hyperlink r:id="rId18" w:history="1">
         <w:r>
           <w:rPr>
             <w:rStyle w:val="Hyperlink"/>
@@ -5481,7 +5579,7 @@
         </w:rPr>
         <w:t xml:space="preserve">, </w:t>
       </w:r>
-      <w:hyperlink r:id="rId18" w:anchor="Sec12" w:history="1">
+      <w:hyperlink r:id="rId19" w:anchor="Sec12" w:history="1">
         <w:r>
           <w:rPr>
             <w:rStyle w:val="Hyperlink"/>
@@ -5500,7 +5598,7 @@
         </w:rPr>
         <w:t xml:space="preserve">, </w:t>
       </w:r>
-      <w:hyperlink r:id="rId19" w:history="1">
+      <w:hyperlink r:id="rId20" w:history="1">
         <w:r>
           <w:rPr>
             <w:rStyle w:val="Hyperlink"/>
@@ -5584,7 +5682,7 @@
         </w:rPr>
         <w:br/>
       </w:r>
-      <w:hyperlink r:id="rId20" w:history="1">
+      <w:hyperlink r:id="rId21" w:history="1">
         <w:r>
           <w:rPr>
             <w:rStyle w:val="Hyperlink"/>
@@ -5603,7 +5701,7 @@
         </w:rPr>
         <w:t xml:space="preserve"> ; </w:t>
       </w:r>
-      <w:hyperlink r:id="rId21" w:history="1">
+      <w:hyperlink r:id="rId22" w:history="1">
         <w:r>
           <w:rPr>
             <w:rStyle w:val="Hyperlink"/>
@@ -5622,7 +5720,7 @@
         </w:rPr>
         <w:t xml:space="preserve">; </w:t>
       </w:r>
-      <w:hyperlink r:id="rId22" w:history="1">
+      <w:hyperlink r:id="rId23" w:history="1">
         <w:r>
           <w:rPr>
             <w:rStyle w:val="Hyperlink"/>
@@ -5650,7 +5748,7 @@
         </w:rPr>
         <w:t xml:space="preserve"> Then, I want you to skim </w:t>
       </w:r>
-      <w:hyperlink r:id="rId23" w:history="1">
+      <w:hyperlink r:id="rId24" w:history="1">
         <w:r>
           <w:rPr>
             <w:rStyle w:val="Hyperlink"/>
@@ -5693,7 +5791,7 @@
         </w:rPr>
         <w:t xml:space="preserve">: a </w:t>
       </w:r>
-      <w:hyperlink r:id="rId24" w:history="1">
+      <w:hyperlink r:id="rId25" w:history="1">
         <w:r>
           <w:rPr>
             <w:rStyle w:val="Hyperlink"/>
@@ -6358,7 +6456,7 @@
         </w:rPr>
         <w:t xml:space="preserve"> in the training data (see </w:t>
       </w:r>
-      <w:hyperlink r:id="rId25" w:anchor="seaborn.displot" w:history="1">
+      <w:hyperlink r:id="rId26" w:anchor="seaborn.displot" w:history="1">
         <w:r>
           <w:rPr>
             <w:rStyle w:val="Hyperlink"/>
@@ -6653,7 +6751,7 @@
         </w:rPr>
         <w:t xml:space="preserve">, which leaves information on the table. You could try some functions from </w:t>
       </w:r>
-      <w:hyperlink r:id="rId26" w:history="1">
+      <w:hyperlink r:id="rId27" w:history="1">
         <w:r>
           <w:rPr>
             <w:rStyle w:val="Hyperlink"/>
@@ -6690,7 +6788,7 @@
         </w:rPr>
         <w:t xml:space="preserve"> has a lot more, and there are more out there. An oft-used one is </w:t>
       </w:r>
-      <w:hyperlink r:id="rId27" w:history="1">
+      <w:hyperlink r:id="rId28" w:history="1">
         <w:proofErr w:type="spellStart"/>
         <w:r>
           <w:rPr>
@@ -6711,7 +6809,7 @@
         </w:rPr>
         <w:t xml:space="preserve">. </w:t>
       </w:r>
-      <w:hyperlink r:id="rId28" w:history="1">
+      <w:hyperlink r:id="rId29" w:history="1">
         <w:proofErr w:type="spellStart"/>
         <w:r>
           <w:rPr>
@@ -6783,7 +6881,7 @@
         </w:rPr>
         <w:t xml:space="preserve">, see </w:t>
       </w:r>
-      <w:hyperlink r:id="rId29" w:history="1">
+      <w:hyperlink r:id="rId30" w:history="1">
         <w:r>
           <w:rPr>
             <w:rStyle w:val="Hyperlink"/>
@@ -6818,7 +6916,7 @@
         </w:rPr>
         <w:t xml:space="preserve">You used PCA for dimensionality reduction, but you </w:t>
       </w:r>
-      <w:hyperlink r:id="rId30" w:anchor="unsupervised-learning" w:history="1">
+      <w:hyperlink r:id="rId31" w:anchor="unsupervised-learning" w:history="1">
         <w:r>
           <w:rPr>
             <w:rStyle w:val="Hyperlink"/>
@@ -6845,7 +6943,7 @@
         </w:rPr>
         <w:t xml:space="preserve"> You could also combine multiple individual classifiers into a </w:t>
       </w:r>
-      <w:hyperlink r:id="rId31" w:anchor="voting-classifier" w:history="1">
+      <w:hyperlink r:id="rId32" w:anchor="voting-classifier" w:history="1">
         <w:r>
           <w:rPr>
             <w:rStyle w:val="Hyperlink"/>
@@ -7401,7 +7499,7 @@
         </w:rPr>
         <w:t xml:space="preserve">Send it to </w:t>
       </w:r>
-      <w:hyperlink r:id="rId32" w:history="1">
+      <w:hyperlink r:id="rId33" w:history="1">
         <w:r>
           <w:rPr>
             <w:rStyle w:val="Hyperlink"/>

</xml_diff>